<commit_message>
Corrige la orientacion del documento: la seccion vertical se habia perdido
</commit_message>
<xml_diff>
--- a/docs/Gutierrez_E1_Completo_v2.docx
+++ b/docs/Gutierrez_E1_Completo_v2.docx
@@ -14360,6 +14360,13 @@
       <w:pPr>
         <w:ind w:left="709" w:hanging="709"/>
         <w:jc w:val="both"/>
+        <w:sectPr>
+          <w:footerReference w:type="default" r:id="rId7"/>
+          <w:pgSz w:w="12240" w:h="15840" w:orient="portrait"/>
+          <w:pgMar w:top="1701" w:right="1701" w:bottom="1701" w:left="2268" w:header="708" w:footer="708" w:gutter="0"/>
+          <w:pgNumType w:start="1" w:fmt="decimal"/>
+          <w:docGrid w:linePitch="360"/>
+        </w:sectPr>
       </w:pPr>
       <w:r>
         <w:t xml:space="preserve">SAKIMURA, Nat, BRADLEY, John, JONES, Michael, DE MEDEIROS, Breno y MORTIMORE, Chuck. </w:t>

</xml_diff>